<commit_message>
v2.5: modos ventilatorios — selector en el simulador, recomendación y docencia
Integra las ramas claude/simulador-modos y claude/modos-motor-docencia:
- Simulador con selector de modo (CPAP, S, S/T, T, PCV, AVAPS): curvas,
  mandos visibles, asincronías y docencia propios de cada modo.
- Modo recomendado en el resultado de la evaluación (alternativas y
  disponibilidad en el parque del área) y sugerencia de cambio de modo
  según evolución en el seguimiento; reglas D-17..D-19 en la base
  científica (Word de revisión y PDF público regenerados).
- Docencia: modos en dos temas (pilares y avanzados, con el aviso
  SERVE-HF de la ASV), 49 preguntas y bibliografía ampliada.
- Manual del Usuario regenerado (Word + PDF, capturas v2.5).
- SW v2.5.0. Tests 42/42.

Co-Authored-By: Claude Fable 5 <noreply@anthropic.com>
</commit_message>
<xml_diff>
--- a/docs/Manual_Usuario_VMNI.docx
+++ b/docs/Manual_Usuario_VMNI.docx
@@ -101,7 +101,7 @@
           <w:sz w:val="22"/>
           <w:szCs w:val="22"/>
         </w:rPr>
-        <w:t xml:space="preserve">Versión v2.4 beta · 2026</w:t>
+        <w:t xml:space="preserve">Versión v2.5 beta · 2026</w:t>
       </w:r>
     </w:p>
     <w:p>
@@ -421,7 +421,7 @@
           </w:pPr>
           <w:hyperlink w:history="1" w:anchor="_Toc13">
             <w:r>
-              <w:t xml:space="preserve">Vistas y perfiles</w:t>
+              <w:t xml:space="preserve">Vistas, modos y perfiles</w:t>
             </w:r>
             <w:r>
               <w:tab/>
@@ -1860,7 +1860,21 @@
         <w:rPr>
           <w:rFonts w:ascii="Calibri" w:cs="Calibri" w:eastAsia="Calibri" w:hAnsi="Calibri"/>
         </w:rPr>
-        <w:t xml:space="preserve">, el modo recomendado (CPAP o BiPAP), los </w:t>
+        <w:t xml:space="preserve">, la tarjeta de </w:t>
+      </w:r>
+      <w:r>
+        <w:rPr>
+          <w:rFonts w:ascii="Calibri" w:cs="Calibri" w:eastAsia="Calibri" w:hAnsi="Calibri"/>
+          <w:b/>
+          <w:bCs/>
+        </w:rPr>
+        <w:t xml:space="preserve">modo ventilatorio recomendado</w:t>
+      </w:r>
+      <w:r>
+        <w:rPr>
+          <w:rFonts w:ascii="Calibri" w:cs="Calibri" w:eastAsia="Calibri" w:hAnsi="Calibri"/>
+        </w:rPr>
+        <w:t xml:space="preserve"> (con alternativas y en qué respirador de su área está disponible), los </w:t>
       </w:r>
       <w:r>
         <w:rPr>
@@ -2197,7 +2211,7 @@
       </w:pPr>
       <w:bookmarkStart w:name="_Toc13" w:id="13"/>
       <w:r>
-        <w:t xml:space="preserve">Vistas y perfiles</w:t>
+        <w:t xml:space="preserve">Vistas, modos y perfiles</w:t>
       </w:r>
       <w:bookmarkEnd w:id="13"/>
     </w:p>
@@ -2223,7 +2237,21 @@
         <w:rPr>
           <w:rFonts w:ascii="Calibri" w:cs="Calibri" w:eastAsia="Calibri" w:hAnsi="Calibri"/>
         </w:rPr>
-        <w:t xml:space="preserve"> (genérico, Breas Vivo, Philips V60 o Hersill VITAE 40 de transporte) y el </w:t>
+        <w:t xml:space="preserve"> (genérico, Breas Vivo, Philips V60 o Hersill VITAE 40 de transporte), el </w:t>
+      </w:r>
+      <w:r>
+        <w:rPr>
+          <w:rFonts w:ascii="Calibri" w:cs="Calibri" w:eastAsia="Calibri" w:hAnsi="Calibri"/>
+          <w:b/>
+          <w:bCs/>
+        </w:rPr>
+        <w:t xml:space="preserve">modo ventilatorio</w:t>
+      </w:r>
+      <w:r>
+        <w:rPr>
+          <w:rFonts w:ascii="Calibri" w:cs="Calibri" w:eastAsia="Calibri" w:hAnsi="Calibri"/>
+        </w:rPr>
+        <w:t xml:space="preserve"> — CPAP, Binivel S, S/T, T, PCV y AVAPS, los de los respiradores reales del área — y el </w:t>
       </w:r>
       <w:r>
         <w:rPr>
@@ -2238,6 +2266,31 @@
           <w:rFonts w:ascii="Calibri" w:cs="Calibri" w:eastAsia="Calibri" w:hAnsi="Calibri"/>
         </w:rPr>
         <w:t xml:space="preserve"> (normal, EPOC o edema agudo de pulmón), cada uno con su mecánica respiratoria característica.</w:t>
+      </w:r>
+    </w:p>
+    <w:p>
+      <w:pPr>
+        <w:spacing w:after="160"/>
+      </w:pPr>
+      <w:r>
+        <w:rPr>
+          <w:rFonts w:ascii="Calibri" w:cs="Calibri" w:eastAsia="Calibri" w:hAnsi="Calibri"/>
+        </w:rPr>
+        <w:t xml:space="preserve">Cada modo cambia las curvas, los </w:t>
+      </w:r>
+      <w:r>
+        <w:rPr>
+          <w:rFonts w:ascii="Calibri" w:cs="Calibri" w:eastAsia="Calibri" w:hAnsi="Calibri"/>
+          <w:b/>
+          <w:bCs/>
+        </w:rPr>
+        <w:t xml:space="preserve">mandos que procede ajustar</w:t>
+      </w:r>
+      <w:r>
+        <w:rPr>
+          <w:rFonts w:ascii="Calibri" w:cs="Calibri" w:eastAsia="Calibri" w:hAnsi="Calibri"/>
+        </w:rPr>
+        <w:t xml:space="preserve"> (CPAP muestra solo presión y FiO₂; S oculta la frecuencia de respaldo; T fija el Ti e ignora los esfuerzos del paciente; PCV cicla por tiempo) y las asincronías que pueden provocarse, con su explicación docente propia.</w:t>
       </w:r>
     </w:p>
     <w:p>
@@ -3419,7 +3472,7 @@
         <w:rPr>
           <w:rFonts w:ascii="Calibri" w:cs="Calibri" w:eastAsia="Calibri" w:hAnsi="Calibri"/>
         </w:rPr>
-        <w:t xml:space="preserve">Diez temas navegables con flechas anterior/siguiente: fisiología respiratoria, </w:t>
+        <w:t xml:space="preserve">Once temas navegables con flechas anterior/siguiente: fisiología respiratoria, </w:t>
       </w:r>
       <w:r>
         <w:rPr>
@@ -3461,7 +3514,35 @@
         <w:rPr>
           <w:rFonts w:ascii="Calibri" w:cs="Calibri" w:eastAsia="Calibri" w:hAnsi="Calibri"/>
         </w:rPr>
-        <w:t xml:space="preserve"> (lectura sistemática en 4 pasos), alto flujo nasal, fundamentos de la VMNI, modos ventilatorios, interfases, asincronías y retirada.</w:t>
+        <w:t xml:space="preserve"> (lectura sistemática en 4 pasos), alto flujo nasal, fundamentos de la VMNI, </w:t>
+      </w:r>
+      <w:r>
+        <w:rPr>
+          <w:rFonts w:ascii="Calibri" w:cs="Calibri" w:eastAsia="Calibri" w:hAnsi="Calibri"/>
+          <w:b/>
+          <w:bCs/>
+        </w:rPr>
+        <w:t xml:space="preserve">modos ventilatorios: los pilares</w:t>
+      </w:r>
+      <w:r>
+        <w:rPr>
+          <w:rFonts w:ascii="Calibri" w:cs="Calibri" w:eastAsia="Calibri" w:hAnsi="Calibri"/>
+        </w:rPr>
+        <w:t xml:space="preserve"> (CPAP, S, S/T, T, PCV), </w:t>
+      </w:r>
+      <w:r>
+        <w:rPr>
+          <w:rFonts w:ascii="Calibri" w:cs="Calibri" w:eastAsia="Calibri" w:hAnsi="Calibri"/>
+          <w:b/>
+          <w:bCs/>
+        </w:rPr>
+        <w:t xml:space="preserve">modos avanzados</w:t>
+      </w:r>
+      <w:r>
+        <w:rPr>
+          <w:rFonts w:ascii="Calibri" w:cs="Calibri" w:eastAsia="Calibri" w:hAnsi="Calibri"/>
+        </w:rPr>
+        <w:t xml:space="preserve"> (AVAPS/iVAPS, PAV, NAVA, PRVC y ASV, con su evidencia real y el aviso de seguridad de la ASV en insuficiencia cardiaca), interfases, asincronías y retirada.</w:t>
       </w:r>
     </w:p>
     <w:p>
@@ -3607,7 +3688,7 @@
           <w:b/>
           <w:bCs/>
         </w:rPr>
-        <w:t xml:space="preserve">44 preguntas</w:t>
+        <w:t xml:space="preserve">49 preguntas</w:t>
       </w:r>
       <w:r>
         <w:rPr>

</xml_diff>